<commit_message>
lab 2 part 1
</commit_message>
<xml_diff>
--- a/lab_2/questions.docx
+++ b/lab_2/questions.docx
@@ -19,7 +19,19 @@
         <w:rPr>
           <w:lang w:val="fr-CA"/>
         </w:rPr>
-        <w:t>boratoire 1 (243-3</w:t>
+        <w:t xml:space="preserve">boratoire </w:t>
+      </w:r>
+      <w:r>
+        <w:rPr>
+          <w:lang w:val="fr-CA"/>
+        </w:rPr>
+        <w:t>2</w:t>
+      </w:r>
+      <w:r>
+        <w:rPr>
+          <w:lang w:val="fr-CA"/>
+        </w:rPr>
+        <w:t xml:space="preserve"> (243-3</w:t>
       </w:r>
       <w:r>
         <w:rPr>
@@ -107,6 +119,23 @@
     <w:p>
       <w:pPr>
         <w:rPr>
+          <w:b/>
+          <w:bCs/>
+          <w:lang w:val="fr-CA"/>
+        </w:rPr>
+      </w:pPr>
+      <w:r>
+        <w:rPr>
+          <w:b/>
+          <w:bCs/>
+          <w:lang w:val="fr-CA"/>
+        </w:rPr>
+        <w:t>PARTIE 1</w:t>
+      </w:r>
+    </w:p>
+    <w:p>
+      <w:pPr>
+        <w:rPr>
           <w:rStyle w:val="SubtleEmphasis"/>
           <w:lang w:val="fr-CA"/>
         </w:rPr>
@@ -130,22 +159,7 @@
           <w:rStyle w:val="SubtleEmphasis"/>
           <w:lang w:val="fr-CA"/>
         </w:rPr>
-        <w:t>Qu’elle est le terme pour préparer la pointe du fer à souder?</w:t>
-      </w:r>
-    </w:p>
-    <w:p>
-      <w:pPr>
-        <w:rPr>
-          <w:rStyle w:val="SubtleEmphasis"/>
-          <w:lang w:val="fr-CA"/>
-        </w:rPr>
-      </w:pPr>
-      <w:r>
-        <w:rPr>
-          <w:rStyle w:val="SubtleEmphasis"/>
-          <w:lang w:val="fr-CA"/>
-        </w:rPr>
-        <w:t xml:space="preserve">                         À quoi ça sert?</w:t>
+        <w:t>Qu’elle est la composition d’un substrat de base sur un PCBs? Est-ce un isolant ou un conducteur?</w:t>
       </w:r>
     </w:p>
     <w:p>
@@ -262,53 +276,30 @@
           <w:rStyle w:val="SubtleEmphasis"/>
           <w:lang w:val="fr-CA"/>
         </w:rPr>
-        <w:t xml:space="preserve"> Décri</w:t>
-      </w:r>
-      <w:r>
-        <w:rPr>
-          <w:rStyle w:val="SubtleEmphasis"/>
-          <w:lang w:val="fr-CA"/>
-        </w:rPr>
-        <w:t>vez</w:t>
-      </w:r>
-      <w:r>
-        <w:rPr>
-          <w:rStyle w:val="SubtleEmphasis"/>
-          <w:lang w:val="fr-CA"/>
-        </w:rPr>
-        <w:t xml:space="preserve"> 2 couches sur </w:t>
-      </w:r>
-      <w:r>
-        <w:rPr>
-          <w:rStyle w:val="SubtleEmphasis"/>
-          <w:lang w:val="fr-CA"/>
-        </w:rPr>
-        <w:t>d</w:t>
-      </w:r>
-      <w:r>
-        <w:rPr>
-          <w:rStyle w:val="SubtleEmphasis"/>
-          <w:lang w:val="fr-CA"/>
-        </w:rPr>
-        <w:t>es circuits imprimés</w:t>
-      </w:r>
-      <w:r>
-        <w:rPr>
-          <w:rStyle w:val="SubtleEmphasis"/>
-          <w:lang w:val="fr-CA"/>
-        </w:rPr>
-        <w:t>,</w:t>
-      </w:r>
-      <w:r>
-        <w:rPr>
-          <w:rStyle w:val="SubtleEmphasis"/>
-          <w:lang w:val="fr-CA"/>
-        </w:rPr>
-        <w:t xml:space="preserve"> ainsi que leur utilité</w:t>
-      </w:r>
-      <w:r>
-        <w:rPr>
-          <w:rStyle w:val="SubtleEmphasis"/>
+        <w:t xml:space="preserve"> </w:t>
+      </w:r>
+      <w:r>
+        <w:rPr>
+          <w:rStyle w:val="SubtleEmphasis"/>
+          <w:lang w:val="fr-CA"/>
+        </w:rPr>
+        <w:t>Dans vos mots, à quoi sert la tresse de cuivre?</w:t>
+      </w:r>
+    </w:p>
+    <w:p>
+      <w:pPr>
+        <w:rPr>
+          <w:rStyle w:val="SubtleEmphasis"/>
+          <w:i w:val="0"/>
+          <w:iCs w:val="0"/>
+          <w:lang w:val="fr-CA"/>
+        </w:rPr>
+      </w:pPr>
+      <w:r>
+        <w:rPr>
+          <w:rStyle w:val="SubtleEmphasis"/>
+          <w:i w:val="0"/>
+          <w:iCs w:val="0"/>
           <w:lang w:val="fr-CA"/>
         </w:rPr>
         <w:t>.</w:t>
@@ -394,6 +385,49 @@
       <w:pPr>
         <w:rPr>
           <w:rStyle w:val="SubtleEmphasis"/>
+          <w:lang w:val="fr-CA"/>
+        </w:rPr>
+      </w:pPr>
+      <w:r>
+        <w:rPr>
+          <w:rStyle w:val="SubtleEmphasis"/>
+          <w:lang w:val="fr-CA"/>
+        </w:rPr>
+        <w:t xml:space="preserve">Question </w:t>
+      </w:r>
+      <w:r>
+        <w:rPr>
+          <w:rStyle w:val="SubtleEmphasis"/>
+          <w:lang w:val="fr-CA"/>
+        </w:rPr>
+        <w:t>3</w:t>
+      </w:r>
+      <w:r>
+        <w:rPr>
+          <w:rStyle w:val="SubtleEmphasis"/>
+          <w:lang w:val="fr-CA"/>
+        </w:rPr>
+        <w:t>:</w:t>
+      </w:r>
+      <w:r>
+        <w:rPr>
+          <w:rStyle w:val="SubtleEmphasis"/>
+          <w:lang w:val="fr-CA"/>
+        </w:rPr>
+        <w:t xml:space="preserve"> </w:t>
+      </w:r>
+      <w:r>
+        <w:rPr>
+          <w:rStyle w:val="SubtleEmphasis"/>
+          <w:lang w:val="fr-CA"/>
+        </w:rPr>
+        <w:t>À quoi sert le Flux Rosin/Résine de Flux?</w:t>
+      </w:r>
+    </w:p>
+    <w:p>
+      <w:pPr>
+        <w:rPr>
+          <w:rStyle w:val="SubtleEmphasis"/>
           <w:i w:val="0"/>
           <w:iCs w:val="0"/>
           <w:lang w:val="fr-CA"/>
@@ -413,12 +447,143 @@
       <w:pPr>
         <w:rPr>
           <w:rStyle w:val="SubtleEmphasis"/>
-          <w:lang w:val="fr-CA"/>
-        </w:rPr>
-      </w:pPr>
-      <w:r>
-        <w:rPr>
-          <w:rStyle w:val="SubtleEmphasis"/>
+          <w:i w:val="0"/>
+          <w:iCs w:val="0"/>
+          <w:lang w:val="fr-CA"/>
+        </w:rPr>
+      </w:pPr>
+      <w:r>
+        <w:rPr>
+          <w:rStyle w:val="SubtleEmphasis"/>
+          <w:i w:val="0"/>
+          <w:iCs w:val="0"/>
+          <w:lang w:val="fr-CA"/>
+        </w:rPr>
+        <w:t>.</w:t>
+      </w:r>
+    </w:p>
+    <w:p>
+      <w:pPr>
+        <w:rPr>
+          <w:rStyle w:val="SubtleEmphasis"/>
+          <w:i w:val="0"/>
+          <w:iCs w:val="0"/>
+          <w:lang w:val="fr-CA"/>
+        </w:rPr>
+      </w:pPr>
+      <w:r>
+        <w:rPr>
+          <w:rStyle w:val="SubtleEmphasis"/>
+          <w:i w:val="0"/>
+          <w:iCs w:val="0"/>
+          <w:lang w:val="fr-CA"/>
+        </w:rPr>
+        <w:t>.</w:t>
+      </w:r>
+    </w:p>
+    <w:p>
+      <w:pPr>
+        <w:rPr>
+          <w:rStyle w:val="SubtleEmphasis"/>
+          <w:i w:val="0"/>
+          <w:iCs w:val="0"/>
+          <w:lang w:val="fr-CA"/>
+        </w:rPr>
+      </w:pPr>
+      <w:r>
+        <w:rPr>
+          <w:rStyle w:val="SubtleEmphasis"/>
+          <w:i w:val="0"/>
+          <w:iCs w:val="0"/>
+          <w:lang w:val="fr-CA"/>
+        </w:rPr>
+        <w:t>.</w:t>
+      </w:r>
+    </w:p>
+    <w:p>
+      <w:pPr>
+        <w:rPr>
+          <w:rStyle w:val="SubtleEmphasis"/>
+          <w:i w:val="0"/>
+          <w:iCs w:val="0"/>
+          <w:lang w:val="fr-CA"/>
+        </w:rPr>
+      </w:pPr>
+    </w:p>
+    <w:p>
+      <w:pPr>
+        <w:rPr>
+          <w:rStyle w:val="SubtleEmphasis"/>
+          <w:i w:val="0"/>
+          <w:iCs w:val="0"/>
+          <w:lang w:val="fr-CA"/>
+        </w:rPr>
+      </w:pPr>
+    </w:p>
+    <w:p>
+      <w:pPr>
+        <w:rPr>
+          <w:rStyle w:val="SubtleEmphasis"/>
+          <w:i w:val="0"/>
+          <w:iCs w:val="0"/>
+          <w:lang w:val="fr-CA"/>
+        </w:rPr>
+      </w:pPr>
+    </w:p>
+    <w:p>
+      <w:pPr>
+        <w:rPr>
+          <w:rStyle w:val="SubtleEmphasis"/>
+          <w:i w:val="0"/>
+          <w:iCs w:val="0"/>
+          <w:lang w:val="fr-CA"/>
+        </w:rPr>
+      </w:pPr>
+    </w:p>
+    <w:p>
+      <w:pPr>
+        <w:rPr>
+          <w:rStyle w:val="SubtleEmphasis"/>
+          <w:b/>
+          <w:bCs/>
+          <w:i w:val="0"/>
+          <w:iCs w:val="0"/>
+          <w:color w:val="auto"/>
+          <w:lang w:val="fr-CA"/>
+        </w:rPr>
+      </w:pPr>
+      <w:r>
+        <w:rPr>
+          <w:b/>
+          <w:bCs/>
+          <w:lang w:val="fr-CA"/>
+        </w:rPr>
+        <w:lastRenderedPageBreak/>
+        <w:t xml:space="preserve">PARTIE </w:t>
+      </w:r>
+      <w:r>
+        <w:rPr>
+          <w:b/>
+          <w:bCs/>
+          <w:lang w:val="fr-CA"/>
+        </w:rPr>
+        <w:t>2</w:t>
+      </w:r>
+    </w:p>
+    <w:p>
+      <w:pPr>
+        <w:rPr>
+          <w:rStyle w:val="SubtleEmphasis"/>
+          <w:i w:val="0"/>
+          <w:iCs w:val="0"/>
+          <w:lang w:val="fr-CA"/>
+        </w:rPr>
+      </w:pPr>
+      <w:r>
+        <w:rPr>
+          <w:rStyle w:val="SubtleEmphasis"/>
+          <w:i w:val="0"/>
+          <w:iCs w:val="0"/>
           <w:lang w:val="fr-CA"/>
         </w:rPr>
         <w:t xml:space="preserve">Question </w:t>
@@ -426,107 +591,754 @@
       <w:r>
         <w:rPr>
           <w:rStyle w:val="SubtleEmphasis"/>
-          <w:lang w:val="fr-CA"/>
-        </w:rPr>
-        <w:t>3</w:t>
-      </w:r>
-      <w:r>
-        <w:rPr>
-          <w:rStyle w:val="SubtleEmphasis"/>
-          <w:lang w:val="fr-CA"/>
-        </w:rPr>
-        <w:t>:</w:t>
-      </w:r>
-      <w:r>
-        <w:rPr>
-          <w:rStyle w:val="SubtleEmphasis"/>
-          <w:lang w:val="fr-CA"/>
-        </w:rPr>
-        <w:t xml:space="preserve"> </w:t>
-      </w:r>
-      <w:r>
-        <w:rPr>
-          <w:rStyle w:val="SubtleEmphasis"/>
-          <w:lang w:val="fr-CA"/>
-        </w:rPr>
-        <w:t>À quoi sert le Flux Rosin/Résine de Flux?</w:t>
-      </w:r>
-    </w:p>
-    <w:p>
-      <w:pPr>
-        <w:rPr>
-          <w:rStyle w:val="SubtleEmphasis"/>
-          <w:i w:val="0"/>
-          <w:iCs w:val="0"/>
-          <w:lang w:val="fr-CA"/>
-        </w:rPr>
-      </w:pPr>
-      <w:r>
-        <w:rPr>
-          <w:rStyle w:val="SubtleEmphasis"/>
-          <w:i w:val="0"/>
-          <w:iCs w:val="0"/>
-          <w:lang w:val="fr-CA"/>
-        </w:rPr>
-        <w:t>.</w:t>
-      </w:r>
-    </w:p>
-    <w:p>
-      <w:pPr>
-        <w:rPr>
-          <w:rStyle w:val="SubtleEmphasis"/>
-          <w:i w:val="0"/>
-          <w:iCs w:val="0"/>
-          <w:lang w:val="fr-CA"/>
-        </w:rPr>
-      </w:pPr>
-      <w:r>
-        <w:rPr>
-          <w:rStyle w:val="SubtleEmphasis"/>
-          <w:i w:val="0"/>
-          <w:iCs w:val="0"/>
-          <w:lang w:val="fr-CA"/>
-        </w:rPr>
-        <w:t>.</w:t>
-      </w:r>
-    </w:p>
-    <w:p>
-      <w:pPr>
-        <w:rPr>
-          <w:rStyle w:val="SubtleEmphasis"/>
-          <w:i w:val="0"/>
-          <w:iCs w:val="0"/>
-          <w:lang w:val="fr-CA"/>
-        </w:rPr>
-      </w:pPr>
-      <w:r>
-        <w:rPr>
-          <w:rStyle w:val="SubtleEmphasis"/>
-          <w:i w:val="0"/>
-          <w:iCs w:val="0"/>
-          <w:lang w:val="fr-CA"/>
-        </w:rPr>
-        <w:t>.</w:t>
-      </w:r>
-    </w:p>
-    <w:p>
-      <w:pPr>
-        <w:rPr>
-          <w:rStyle w:val="SubtleEmphasis"/>
-          <w:i w:val="0"/>
-          <w:iCs w:val="0"/>
-          <w:lang w:val="fr-CA"/>
-        </w:rPr>
-      </w:pPr>
-      <w:r>
-        <w:rPr>
-          <w:rStyle w:val="SubtleEmphasis"/>
-          <w:i w:val="0"/>
-          <w:iCs w:val="0"/>
-          <w:lang w:val="fr-CA"/>
-        </w:rPr>
-        <w:t>.</w:t>
-      </w:r>
+          <w:i w:val="0"/>
+          <w:iCs w:val="0"/>
+          <w:lang w:val="fr-CA"/>
+        </w:rPr>
+        <w:t>1</w:t>
+      </w:r>
+      <w:r>
+        <w:rPr>
+          <w:rStyle w:val="SubtleEmphasis"/>
+          <w:i w:val="0"/>
+          <w:iCs w:val="0"/>
+          <w:lang w:val="fr-CA"/>
+        </w:rPr>
+        <w:t> : Amener votre PCBs de test à l’enseignant.</w:t>
+      </w:r>
+      <w:r>
+        <w:rPr>
+          <w:rStyle w:val="SubtleEmphasis"/>
+          <w:i w:val="0"/>
+          <w:iCs w:val="0"/>
+          <w:lang w:val="fr-CA"/>
+        </w:rPr>
+        <w:br/>
+        <w:t>À remplir après :</w:t>
+      </w:r>
+    </w:p>
+    <w:p>
+      <w:pPr>
+        <w:rPr>
+          <w:rStyle w:val="SubtleEmphasis"/>
+          <w:i w:val="0"/>
+          <w:iCs w:val="0"/>
+          <w:lang w:val="fr-CA"/>
+        </w:rPr>
+      </w:pPr>
+      <w:r>
+        <w:rPr>
+          <w:rStyle w:val="SubtleEmphasis"/>
+          <w:i w:val="0"/>
+          <w:iCs w:val="0"/>
+          <w:lang w:val="fr-CA"/>
+        </w:rPr>
+        <w:t>Légende ‘Severity’:</w:t>
+      </w:r>
+    </w:p>
+    <w:p>
+      <w:pPr>
+        <w:pStyle w:val="ListParagraph"/>
+        <w:numPr>
+          <w:ilvl w:val="0"/>
+          <w:numId w:val="1"/>
+        </w:numPr>
+        <w:rPr>
+          <w:rStyle w:val="SubtleEmphasis"/>
+          <w:i w:val="0"/>
+          <w:iCs w:val="0"/>
+          <w:lang w:val="fr-CA"/>
+        </w:rPr>
+      </w:pPr>
+      <w:r>
+        <w:rPr>
+          <w:rStyle w:val="SubtleEmphasis"/>
+          <w:i w:val="0"/>
+          <w:iCs w:val="0"/>
+          <w:lang w:val="fr-CA"/>
+        </w:rPr>
+        <w:t>LOW : Esthétique ou erreur minime</w:t>
+      </w:r>
+    </w:p>
+    <w:p>
+      <w:pPr>
+        <w:pStyle w:val="ListParagraph"/>
+        <w:numPr>
+          <w:ilvl w:val="0"/>
+          <w:numId w:val="1"/>
+        </w:numPr>
+        <w:rPr>
+          <w:rStyle w:val="SubtleEmphasis"/>
+          <w:i w:val="0"/>
+          <w:iCs w:val="0"/>
+          <w:lang w:val="fr-CA"/>
+        </w:rPr>
+      </w:pPr>
+      <w:r>
+        <w:rPr>
+          <w:rStyle w:val="SubtleEmphasis"/>
+          <w:i w:val="0"/>
+          <w:iCs w:val="0"/>
+          <w:lang w:val="fr-CA"/>
+        </w:rPr>
+        <w:t>MEDIUM : Court-circuit</w:t>
+      </w:r>
+    </w:p>
+    <w:p>
+      <w:pPr>
+        <w:pStyle w:val="ListParagraph"/>
+        <w:numPr>
+          <w:ilvl w:val="0"/>
+          <w:numId w:val="1"/>
+        </w:numPr>
+        <w:rPr>
+          <w:rStyle w:val="SubtleEmphasis"/>
+          <w:i w:val="0"/>
+          <w:iCs w:val="0"/>
+          <w:lang w:val="fr-CA"/>
+        </w:rPr>
+      </w:pPr>
+      <w:r>
+        <w:rPr>
+          <w:rStyle w:val="SubtleEmphasis"/>
+          <w:i w:val="0"/>
+          <w:iCs w:val="0"/>
+          <w:lang w:val="fr-CA"/>
+        </w:rPr>
+        <w:t>HIGH : Composant manquants</w:t>
+      </w:r>
+    </w:p>
+    <w:p>
+      <w:pPr>
+        <w:pStyle w:val="ListParagraph"/>
+        <w:numPr>
+          <w:ilvl w:val="0"/>
+          <w:numId w:val="1"/>
+        </w:numPr>
+        <w:rPr>
+          <w:rStyle w:val="SubtleEmphasis"/>
+          <w:i w:val="0"/>
+          <w:iCs w:val="0"/>
+          <w:lang w:val="fr-CA"/>
+        </w:rPr>
+      </w:pPr>
+      <w:r>
+        <w:rPr>
+          <w:rStyle w:val="SubtleEmphasis"/>
+          <w:i w:val="0"/>
+          <w:iCs w:val="0"/>
+          <w:lang w:val="fr-CA"/>
+        </w:rPr>
+        <w:t>CRITICAL : Problème d’alimentation, ne peux pas démarrer</w:t>
+      </w:r>
+      <w:r>
+        <w:rPr>
+          <w:rStyle w:val="SubtleEmphasis"/>
+          <w:i w:val="0"/>
+          <w:iCs w:val="0"/>
+          <w:lang w:val="fr-CA"/>
+        </w:rPr>
+        <w:br/>
+      </w:r>
+      <w:r>
+        <w:rPr>
+          <w:rStyle w:val="SubtleEmphasis"/>
+          <w:i w:val="0"/>
+          <w:iCs w:val="0"/>
+          <w:lang w:val="fr-CA"/>
+        </w:rPr>
+        <w:br/>
+      </w:r>
+    </w:p>
+    <w:tbl>
+      <w:tblPr>
+        <w:tblStyle w:val="TableGrid"/>
+        <w:tblW w:w="0" w:type="auto"/>
+        <w:tblLook w:val="04A0" w:firstRow="1" w:lastRow="0" w:firstColumn="1" w:lastColumn="0" w:noHBand="0" w:noVBand="1"/>
+      </w:tblPr>
+      <w:tblGrid>
+        <w:gridCol w:w="1617"/>
+        <w:gridCol w:w="3173"/>
+        <w:gridCol w:w="3570"/>
+        <w:gridCol w:w="990"/>
+      </w:tblGrid>
+      <w:tr>
+        <w:tc>
+          <w:tcPr>
+            <w:tcW w:w="1413" w:type="dxa"/>
+          </w:tcPr>
+          <w:p>
+            <w:pPr>
+              <w:rPr>
+                <w:rStyle w:val="SubtleEmphasis"/>
+                <w:b/>
+                <w:bCs/>
+                <w:i w:val="0"/>
+                <w:iCs w:val="0"/>
+                <w:lang w:val="fr-CA"/>
+              </w:rPr>
+            </w:pPr>
+            <w:r>
+              <w:rPr>
+                <w:rStyle w:val="SubtleEmphasis"/>
+                <w:b/>
+                <w:bCs/>
+                <w:i w:val="0"/>
+                <w:iCs w:val="0"/>
+                <w:lang w:val="fr-CA"/>
+              </w:rPr>
+              <w:t>Defect tracker</w:t>
+            </w:r>
+          </w:p>
+        </w:tc>
+        <w:tc>
+          <w:tcPr>
+            <w:tcW w:w="3261" w:type="dxa"/>
+          </w:tcPr>
+          <w:p>
+            <w:pPr>
+              <w:rPr>
+                <w:rStyle w:val="SubtleEmphasis"/>
+                <w:i w:val="0"/>
+                <w:iCs w:val="0"/>
+                <w:lang w:val="fr-CA"/>
+              </w:rPr>
+            </w:pPr>
+          </w:p>
+        </w:tc>
+        <w:tc>
+          <w:tcPr>
+            <w:tcW w:w="3685" w:type="dxa"/>
+          </w:tcPr>
+          <w:p>
+            <w:pPr>
+              <w:rPr>
+                <w:rStyle w:val="SubtleEmphasis"/>
+                <w:i w:val="0"/>
+                <w:iCs w:val="0"/>
+                <w:lang w:val="fr-CA"/>
+              </w:rPr>
+            </w:pPr>
+          </w:p>
+        </w:tc>
+        <w:tc>
+          <w:tcPr>
+            <w:tcW w:w="991" w:type="dxa"/>
+          </w:tcPr>
+          <w:p>
+            <w:pPr>
+              <w:rPr>
+                <w:rStyle w:val="SubtleEmphasis"/>
+                <w:i w:val="0"/>
+                <w:iCs w:val="0"/>
+                <w:lang w:val="fr-CA"/>
+              </w:rPr>
+            </w:pPr>
+          </w:p>
+        </w:tc>
+      </w:tr>
+      <w:tr>
+        <w:tc>
+          <w:tcPr>
+            <w:tcW w:w="1413" w:type="dxa"/>
+          </w:tcPr>
+          <w:p>
+            <w:pPr>
+              <w:rPr>
+                <w:rStyle w:val="SubtleEmphasis"/>
+                <w:b/>
+                <w:bCs/>
+                <w:i w:val="0"/>
+                <w:iCs w:val="0"/>
+                <w:lang w:val="fr-CA"/>
+              </w:rPr>
+            </w:pPr>
+            <w:r>
+              <w:rPr>
+                <w:rStyle w:val="SubtleEmphasis"/>
+                <w:b/>
+                <w:bCs/>
+                <w:i w:val="0"/>
+                <w:iCs w:val="0"/>
+                <w:lang w:val="fr-CA"/>
+              </w:rPr>
+              <w:t>TECHNICIAN :</w:t>
+            </w:r>
+          </w:p>
+        </w:tc>
+        <w:tc>
+          <w:tcPr>
+            <w:tcW w:w="3261" w:type="dxa"/>
+          </w:tcPr>
+          <w:p>
+            <w:pPr>
+              <w:rPr>
+                <w:rStyle w:val="SubtleEmphasis"/>
+                <w:i w:val="0"/>
+                <w:iCs w:val="0"/>
+                <w:lang w:val="fr-CA"/>
+              </w:rPr>
+            </w:pPr>
+            <w:r>
+              <w:rPr>
+                <w:rStyle w:val="SubtleEmphasis"/>
+                <w:i w:val="0"/>
+                <w:iCs w:val="0"/>
+                <w:lang w:val="fr-CA"/>
+              </w:rPr>
+              <w:t>VOTRE NOM</w:t>
+            </w:r>
+          </w:p>
+        </w:tc>
+        <w:tc>
+          <w:tcPr>
+            <w:tcW w:w="3685" w:type="dxa"/>
+          </w:tcPr>
+          <w:p>
+            <w:pPr>
+              <w:rPr>
+                <w:rStyle w:val="SubtleEmphasis"/>
+                <w:i w:val="0"/>
+                <w:iCs w:val="0"/>
+                <w:lang w:val="fr-CA"/>
+              </w:rPr>
+            </w:pPr>
+          </w:p>
+        </w:tc>
+        <w:tc>
+          <w:tcPr>
+            <w:tcW w:w="991" w:type="dxa"/>
+          </w:tcPr>
+          <w:p>
+            <w:pPr>
+              <w:rPr>
+                <w:rStyle w:val="SubtleEmphasis"/>
+                <w:i w:val="0"/>
+                <w:iCs w:val="0"/>
+                <w:lang w:val="fr-CA"/>
+              </w:rPr>
+            </w:pPr>
+          </w:p>
+        </w:tc>
+      </w:tr>
+      <w:tr>
+        <w:tc>
+          <w:tcPr>
+            <w:tcW w:w="1413" w:type="dxa"/>
+          </w:tcPr>
+          <w:p>
+            <w:pPr>
+              <w:rPr>
+                <w:rStyle w:val="SubtleEmphasis"/>
+                <w:i w:val="0"/>
+                <w:iCs w:val="0"/>
+                <w:lang w:val="fr-CA"/>
+              </w:rPr>
+            </w:pPr>
+          </w:p>
+        </w:tc>
+        <w:tc>
+          <w:tcPr>
+            <w:tcW w:w="3261" w:type="dxa"/>
+          </w:tcPr>
+          <w:p>
+            <w:pPr>
+              <w:rPr>
+                <w:rStyle w:val="SubtleEmphasis"/>
+                <w:i w:val="0"/>
+                <w:iCs w:val="0"/>
+                <w:lang w:val="fr-CA"/>
+              </w:rPr>
+            </w:pPr>
+          </w:p>
+        </w:tc>
+        <w:tc>
+          <w:tcPr>
+            <w:tcW w:w="3685" w:type="dxa"/>
+          </w:tcPr>
+          <w:p>
+            <w:pPr>
+              <w:rPr>
+                <w:rStyle w:val="SubtleEmphasis"/>
+                <w:i w:val="0"/>
+                <w:iCs w:val="0"/>
+                <w:lang w:val="fr-CA"/>
+              </w:rPr>
+            </w:pPr>
+          </w:p>
+        </w:tc>
+        <w:tc>
+          <w:tcPr>
+            <w:tcW w:w="991" w:type="dxa"/>
+          </w:tcPr>
+          <w:p>
+            <w:pPr>
+              <w:rPr>
+                <w:rStyle w:val="SubtleEmphasis"/>
+                <w:i w:val="0"/>
+                <w:iCs w:val="0"/>
+                <w:lang w:val="fr-CA"/>
+              </w:rPr>
+            </w:pPr>
+          </w:p>
+        </w:tc>
+      </w:tr>
+      <w:tr>
+        <w:tc>
+          <w:tcPr>
+            <w:tcW w:w="1413" w:type="dxa"/>
+          </w:tcPr>
+          <w:p>
+            <w:pPr>
+              <w:rPr>
+                <w:rStyle w:val="SubtleEmphasis"/>
+                <w:i w:val="0"/>
+                <w:iCs w:val="0"/>
+                <w:lang w:val="fr-CA"/>
+              </w:rPr>
+            </w:pPr>
+            <w:r>
+              <w:rPr>
+                <w:rStyle w:val="SubtleEmphasis"/>
+                <w:i w:val="0"/>
+                <w:iCs w:val="0"/>
+                <w:lang w:val="fr-CA"/>
+              </w:rPr>
+              <w:t>Defect ID</w:t>
+            </w:r>
+          </w:p>
+        </w:tc>
+        <w:tc>
+          <w:tcPr>
+            <w:tcW w:w="3261" w:type="dxa"/>
+          </w:tcPr>
+          <w:p>
+            <w:pPr>
+              <w:rPr>
+                <w:rStyle w:val="SubtleEmphasis"/>
+                <w:i w:val="0"/>
+                <w:iCs w:val="0"/>
+                <w:lang w:val="fr-CA"/>
+              </w:rPr>
+            </w:pPr>
+            <w:r>
+              <w:rPr>
+                <w:rStyle w:val="SubtleEmphasis"/>
+                <w:i w:val="0"/>
+                <w:iCs w:val="0"/>
+                <w:lang w:val="fr-CA"/>
+              </w:rPr>
+              <w:t>Components</w:t>
+            </w:r>
+          </w:p>
+        </w:tc>
+        <w:tc>
+          <w:tcPr>
+            <w:tcW w:w="3685" w:type="dxa"/>
+          </w:tcPr>
+          <w:p>
+            <w:pPr>
+              <w:rPr>
+                <w:rStyle w:val="SubtleEmphasis"/>
+                <w:i w:val="0"/>
+                <w:iCs w:val="0"/>
+                <w:lang w:val="fr-CA"/>
+              </w:rPr>
+            </w:pPr>
+            <w:r>
+              <w:rPr>
+                <w:rStyle w:val="SubtleEmphasis"/>
+                <w:i w:val="0"/>
+                <w:iCs w:val="0"/>
+                <w:lang w:val="fr-CA"/>
+              </w:rPr>
+              <w:t>Description</w:t>
+            </w:r>
+          </w:p>
+        </w:tc>
+        <w:tc>
+          <w:tcPr>
+            <w:tcW w:w="991" w:type="dxa"/>
+          </w:tcPr>
+          <w:p>
+            <w:pPr>
+              <w:rPr>
+                <w:rStyle w:val="SubtleEmphasis"/>
+                <w:i w:val="0"/>
+                <w:iCs w:val="0"/>
+                <w:lang w:val="fr-CA"/>
+              </w:rPr>
+            </w:pPr>
+            <w:r>
+              <w:rPr>
+                <w:rStyle w:val="SubtleEmphasis"/>
+                <w:i w:val="0"/>
+                <w:iCs w:val="0"/>
+                <w:lang w:val="fr-CA"/>
+              </w:rPr>
+              <w:t>Severity</w:t>
+            </w:r>
+          </w:p>
+        </w:tc>
+      </w:tr>
+      <w:tr>
+        <w:tc>
+          <w:tcPr>
+            <w:tcW w:w="1413" w:type="dxa"/>
+          </w:tcPr>
+          <w:p>
+            <w:pPr>
+              <w:rPr>
+                <w:rStyle w:val="SubtleEmphasis"/>
+                <w:i w:val="0"/>
+                <w:iCs w:val="0"/>
+                <w:lang w:val="fr-CA"/>
+              </w:rPr>
+            </w:pPr>
+          </w:p>
+        </w:tc>
+        <w:tc>
+          <w:tcPr>
+            <w:tcW w:w="3261" w:type="dxa"/>
+          </w:tcPr>
+          <w:p>
+            <w:pPr>
+              <w:rPr>
+                <w:rStyle w:val="SubtleEmphasis"/>
+                <w:i w:val="0"/>
+                <w:iCs w:val="0"/>
+                <w:lang w:val="fr-CA"/>
+              </w:rPr>
+            </w:pPr>
+          </w:p>
+        </w:tc>
+        <w:tc>
+          <w:tcPr>
+            <w:tcW w:w="3685" w:type="dxa"/>
+          </w:tcPr>
+          <w:p>
+            <w:pPr>
+              <w:rPr>
+                <w:rStyle w:val="SubtleEmphasis"/>
+                <w:i w:val="0"/>
+                <w:iCs w:val="0"/>
+                <w:lang w:val="fr-CA"/>
+              </w:rPr>
+            </w:pPr>
+          </w:p>
+        </w:tc>
+        <w:tc>
+          <w:tcPr>
+            <w:tcW w:w="991" w:type="dxa"/>
+          </w:tcPr>
+          <w:p>
+            <w:pPr>
+              <w:rPr>
+                <w:rStyle w:val="SubtleEmphasis"/>
+                <w:i w:val="0"/>
+                <w:iCs w:val="0"/>
+                <w:lang w:val="fr-CA"/>
+              </w:rPr>
+            </w:pPr>
+          </w:p>
+        </w:tc>
+      </w:tr>
+      <w:tr>
+        <w:tc>
+          <w:tcPr>
+            <w:tcW w:w="1413" w:type="dxa"/>
+          </w:tcPr>
+          <w:p>
+            <w:pPr>
+              <w:rPr>
+                <w:rStyle w:val="SubtleEmphasis"/>
+                <w:i w:val="0"/>
+                <w:iCs w:val="0"/>
+                <w:lang w:val="fr-CA"/>
+              </w:rPr>
+            </w:pPr>
+          </w:p>
+        </w:tc>
+        <w:tc>
+          <w:tcPr>
+            <w:tcW w:w="3261" w:type="dxa"/>
+          </w:tcPr>
+          <w:p>
+            <w:pPr>
+              <w:rPr>
+                <w:rStyle w:val="SubtleEmphasis"/>
+                <w:i w:val="0"/>
+                <w:iCs w:val="0"/>
+                <w:lang w:val="fr-CA"/>
+              </w:rPr>
+            </w:pPr>
+          </w:p>
+        </w:tc>
+        <w:tc>
+          <w:tcPr>
+            <w:tcW w:w="3685" w:type="dxa"/>
+          </w:tcPr>
+          <w:p>
+            <w:pPr>
+              <w:rPr>
+                <w:rStyle w:val="SubtleEmphasis"/>
+                <w:i w:val="0"/>
+                <w:iCs w:val="0"/>
+                <w:lang w:val="fr-CA"/>
+              </w:rPr>
+            </w:pPr>
+          </w:p>
+        </w:tc>
+        <w:tc>
+          <w:tcPr>
+            <w:tcW w:w="991" w:type="dxa"/>
+          </w:tcPr>
+          <w:p>
+            <w:pPr>
+              <w:rPr>
+                <w:rStyle w:val="SubtleEmphasis"/>
+                <w:i w:val="0"/>
+                <w:iCs w:val="0"/>
+                <w:lang w:val="fr-CA"/>
+              </w:rPr>
+            </w:pPr>
+          </w:p>
+        </w:tc>
+      </w:tr>
+      <w:tr>
+        <w:tc>
+          <w:tcPr>
+            <w:tcW w:w="1413" w:type="dxa"/>
+          </w:tcPr>
+          <w:p>
+            <w:pPr>
+              <w:rPr>
+                <w:rStyle w:val="SubtleEmphasis"/>
+                <w:i w:val="0"/>
+                <w:iCs w:val="0"/>
+                <w:lang w:val="fr-CA"/>
+              </w:rPr>
+            </w:pPr>
+          </w:p>
+        </w:tc>
+        <w:tc>
+          <w:tcPr>
+            <w:tcW w:w="3261" w:type="dxa"/>
+          </w:tcPr>
+          <w:p>
+            <w:pPr>
+              <w:rPr>
+                <w:rStyle w:val="SubtleEmphasis"/>
+                <w:i w:val="0"/>
+                <w:iCs w:val="0"/>
+                <w:lang w:val="fr-CA"/>
+              </w:rPr>
+            </w:pPr>
+          </w:p>
+        </w:tc>
+        <w:tc>
+          <w:tcPr>
+            <w:tcW w:w="3685" w:type="dxa"/>
+          </w:tcPr>
+          <w:p>
+            <w:pPr>
+              <w:rPr>
+                <w:rStyle w:val="SubtleEmphasis"/>
+                <w:i w:val="0"/>
+                <w:iCs w:val="0"/>
+                <w:lang w:val="fr-CA"/>
+              </w:rPr>
+            </w:pPr>
+          </w:p>
+        </w:tc>
+        <w:tc>
+          <w:tcPr>
+            <w:tcW w:w="991" w:type="dxa"/>
+          </w:tcPr>
+          <w:p>
+            <w:pPr>
+              <w:rPr>
+                <w:rStyle w:val="SubtleEmphasis"/>
+                <w:i w:val="0"/>
+                <w:iCs w:val="0"/>
+                <w:lang w:val="fr-CA"/>
+              </w:rPr>
+            </w:pPr>
+          </w:p>
+        </w:tc>
+      </w:tr>
+      <w:tr>
+        <w:tc>
+          <w:tcPr>
+            <w:tcW w:w="1413" w:type="dxa"/>
+          </w:tcPr>
+          <w:p>
+            <w:pPr>
+              <w:rPr>
+                <w:rStyle w:val="SubtleEmphasis"/>
+                <w:i w:val="0"/>
+                <w:iCs w:val="0"/>
+                <w:lang w:val="fr-CA"/>
+              </w:rPr>
+            </w:pPr>
+          </w:p>
+        </w:tc>
+        <w:tc>
+          <w:tcPr>
+            <w:tcW w:w="3261" w:type="dxa"/>
+          </w:tcPr>
+          <w:p>
+            <w:pPr>
+              <w:rPr>
+                <w:rStyle w:val="SubtleEmphasis"/>
+                <w:i w:val="0"/>
+                <w:iCs w:val="0"/>
+                <w:lang w:val="fr-CA"/>
+              </w:rPr>
+            </w:pPr>
+          </w:p>
+        </w:tc>
+        <w:tc>
+          <w:tcPr>
+            <w:tcW w:w="3685" w:type="dxa"/>
+          </w:tcPr>
+          <w:p>
+            <w:pPr>
+              <w:rPr>
+                <w:rStyle w:val="SubtleEmphasis"/>
+                <w:i w:val="0"/>
+                <w:iCs w:val="0"/>
+                <w:lang w:val="fr-CA"/>
+              </w:rPr>
+            </w:pPr>
+          </w:p>
+        </w:tc>
+        <w:tc>
+          <w:tcPr>
+            <w:tcW w:w="991" w:type="dxa"/>
+          </w:tcPr>
+          <w:p>
+            <w:pPr>
+              <w:rPr>
+                <w:rStyle w:val="SubtleEmphasis"/>
+                <w:i w:val="0"/>
+                <w:iCs w:val="0"/>
+                <w:lang w:val="fr-CA"/>
+              </w:rPr>
+            </w:pPr>
+          </w:p>
+        </w:tc>
+      </w:tr>
+    </w:tbl>
+    <w:p>
+      <w:pPr>
+        <w:rPr>
+          <w:rStyle w:val="SubtleEmphasis"/>
+          <w:i w:val="0"/>
+          <w:iCs w:val="0"/>
+          <w:lang w:val="fr-CA"/>
+        </w:rPr>
+      </w:pPr>
     </w:p>
     <w:p>
       <w:pPr>
@@ -546,6 +1358,126 @@
     </w:sectPr>
   </w:body>
 </w:document>
+</file>
+
+<file path=word/numbering.xml><?xml version="1.0" encoding="utf-8"?>
+<w:numbering xmlns:wpc="http://schemas.microsoft.com/office/word/2010/wordprocessingCanvas" xmlns:cx="http://schemas.microsoft.com/office/drawing/2014/chartex" xmlns:cx1="http://schemas.microsoft.com/office/drawing/2015/9/8/chartex" xmlns:cx2="http://schemas.microsoft.com/office/drawing/2015/10/21/chartex" xmlns:cx3="http://schemas.microsoft.com/office/drawing/2016/5/9/chartex" xmlns:cx4="http://schemas.microsoft.com/office/drawing/2016/5/10/chartex" xmlns:cx5="http://schemas.microsoft.com/office/drawing/2016/5/11/chartex" xmlns:cx6="http://schemas.microsoft.com/office/drawing/2016/5/12/chartex" xmlns:cx7="http://schemas.microsoft.com/office/drawing/2016/5/13/chartex" xmlns:cx8="http://schemas.microsoft.com/office/drawing/2016/5/14/chartex" xmlns:mc="http://schemas.openxmlformats.org/markup-compatibility/2006" xmlns:aink="http://schemas.microsoft.com/office/drawing/2016/ink" xmlns:am3d="http://schemas.microsoft.com/office/drawing/2017/model3d" xmlns:o="urn:schemas-microsoft-com:office:office" xmlns:oel="http://schemas.microsoft.com/office/2019/extlst" xmlns:r="http://schemas.openxmlformats.org/officeDocument/2006/relationships" xmlns:m="http://schemas.openxmlformats.org/officeDocument/2006/math" xmlns:v="urn:schemas-microsoft-com:vml" xmlns:wp14="http://schemas.microsoft.com/office/word/2010/wordprocessingDrawing" xmlns:wp="http://schemas.openxmlformats.org/drawingml/2006/wordprocessingDrawing" xmlns:w10="urn:schemas-microsoft-com:office:word" xmlns:w="http://schemas.openxmlformats.org/wordprocessingml/2006/main" xmlns:w14="http://schemas.microsoft.com/office/word/2010/wordml" xmlns:w15="http://schemas.microsoft.com/office/word/2012/wordml" xmlns:w16cei="http://schemas.microsoft.com/office/word/2026/wordml/cei" xmlns:w16cex="http://schemas.microsoft.com/office/word/2018/wordml/cex" xmlns:w16cid="http://schemas.microsoft.com/office/word/2016/wordml/cid" xmlns:w16="http://schemas.microsoft.com/office/word/2018/wordml" xmlns:w16du="http://schemas.microsoft.com/office/word/2023/wordml/word16du" xmlns:w16sdtdh="http://schemas.microsoft.com/office/word/2020/wordml/sdtdatahash" xmlns:w16sdtfl="http://schemas.microsoft.com/office/word/2024/wordml/sdtformatlock" xmlns:w16se="http://schemas.microsoft.com/office/word/2015/wordml/symex" xmlns:wpg="http://schemas.microsoft.com/office/word/2010/wordprocessingGroup" xmlns:wpi="http://schemas.microsoft.com/office/word/2010/wordprocessingInk" xmlns:wne="http://schemas.microsoft.com/office/word/2006/wordml" xmlns:wps="http://schemas.microsoft.com/office/word/2010/wordprocessingShape" mc:Ignorable="w14 w15 w16se w16cid w16 w16cex w16sdtdh w16sdtfl w16du wp14">
+  <w:abstractNum w:abstractNumId="0" w15:restartNumberingAfterBreak="0">
+    <w:nsid w:val="51E44F5C"/>
+    <w:multiLevelType w:val="hybridMultilevel"/>
+    <w:tmpl w:val="D2C6B3CE"/>
+    <w:lvl w:ilvl="0" w:tplc="3E06E932">
+      <w:numFmt w:val="bullet"/>
+      <w:lvlText w:val="-"/>
+      <w:lvlJc w:val="left"/>
+      <w:pPr>
+        <w:ind w:left="720" w:hanging="360"/>
+      </w:pPr>
+      <w:rPr>
+        <w:rFonts w:ascii="Aptos" w:eastAsiaTheme="minorHAnsi" w:hAnsi="Aptos" w:cstheme="minorBidi" w:hint="default"/>
+      </w:rPr>
+    </w:lvl>
+    <w:lvl w:ilvl="1" w:tplc="10090003" w:tentative="1">
+      <w:start w:val="1"/>
+      <w:numFmt w:val="bullet"/>
+      <w:lvlText w:val="o"/>
+      <w:lvlJc w:val="left"/>
+      <w:pPr>
+        <w:ind w:left="1440" w:hanging="360"/>
+      </w:pPr>
+      <w:rPr>
+        <w:rFonts w:ascii="Courier New" w:hAnsi="Courier New" w:cs="Courier New" w:hint="default"/>
+      </w:rPr>
+    </w:lvl>
+    <w:lvl w:ilvl="2" w:tplc="10090005" w:tentative="1">
+      <w:start w:val="1"/>
+      <w:numFmt w:val="bullet"/>
+      <w:lvlText w:val=""/>
+      <w:lvlJc w:val="left"/>
+      <w:pPr>
+        <w:ind w:left="2160" w:hanging="360"/>
+      </w:pPr>
+      <w:rPr>
+        <w:rFonts w:ascii="Wingdings" w:hAnsi="Wingdings" w:hint="default"/>
+      </w:rPr>
+    </w:lvl>
+    <w:lvl w:ilvl="3" w:tplc="10090001" w:tentative="1">
+      <w:start w:val="1"/>
+      <w:numFmt w:val="bullet"/>
+      <w:lvlText w:val=""/>
+      <w:lvlJc w:val="left"/>
+      <w:pPr>
+        <w:ind w:left="2880" w:hanging="360"/>
+      </w:pPr>
+      <w:rPr>
+        <w:rFonts w:ascii="Symbol" w:hAnsi="Symbol" w:hint="default"/>
+      </w:rPr>
+    </w:lvl>
+    <w:lvl w:ilvl="4" w:tplc="10090003" w:tentative="1">
+      <w:start w:val="1"/>
+      <w:numFmt w:val="bullet"/>
+      <w:lvlText w:val="o"/>
+      <w:lvlJc w:val="left"/>
+      <w:pPr>
+        <w:ind w:left="3600" w:hanging="360"/>
+      </w:pPr>
+      <w:rPr>
+        <w:rFonts w:ascii="Courier New" w:hAnsi="Courier New" w:cs="Courier New" w:hint="default"/>
+      </w:rPr>
+    </w:lvl>
+    <w:lvl w:ilvl="5" w:tplc="10090005" w:tentative="1">
+      <w:start w:val="1"/>
+      <w:numFmt w:val="bullet"/>
+      <w:lvlText w:val=""/>
+      <w:lvlJc w:val="left"/>
+      <w:pPr>
+        <w:ind w:left="4320" w:hanging="360"/>
+      </w:pPr>
+      <w:rPr>
+        <w:rFonts w:ascii="Wingdings" w:hAnsi="Wingdings" w:hint="default"/>
+      </w:rPr>
+    </w:lvl>
+    <w:lvl w:ilvl="6" w:tplc="10090001" w:tentative="1">
+      <w:start w:val="1"/>
+      <w:numFmt w:val="bullet"/>
+      <w:lvlText w:val=""/>
+      <w:lvlJc w:val="left"/>
+      <w:pPr>
+        <w:ind w:left="5040" w:hanging="360"/>
+      </w:pPr>
+      <w:rPr>
+        <w:rFonts w:ascii="Symbol" w:hAnsi="Symbol" w:hint="default"/>
+      </w:rPr>
+    </w:lvl>
+    <w:lvl w:ilvl="7" w:tplc="10090003" w:tentative="1">
+      <w:start w:val="1"/>
+      <w:numFmt w:val="bullet"/>
+      <w:lvlText w:val="o"/>
+      <w:lvlJc w:val="left"/>
+      <w:pPr>
+        <w:ind w:left="5760" w:hanging="360"/>
+      </w:pPr>
+      <w:rPr>
+        <w:rFonts w:ascii="Courier New" w:hAnsi="Courier New" w:cs="Courier New" w:hint="default"/>
+      </w:rPr>
+    </w:lvl>
+    <w:lvl w:ilvl="8" w:tplc="10090005" w:tentative="1">
+      <w:start w:val="1"/>
+      <w:numFmt w:val="bullet"/>
+      <w:lvlText w:val=""/>
+      <w:lvlJc w:val="left"/>
+      <w:pPr>
+        <w:ind w:left="6480" w:hanging="360"/>
+      </w:pPr>
+      <w:rPr>
+        <w:rFonts w:ascii="Wingdings" w:hAnsi="Wingdings" w:hint="default"/>
+      </w:rPr>
+    </w:lvl>
+  </w:abstractNum>
+  <w:num w:numId="1" w16cid:durableId="1715108812">
+    <w:abstractNumId w:val="0"/>
+  </w:num>
+</w:numbering>
 </file>
 
 <file path=word/styles.xml><?xml version="1.0" encoding="utf-8"?>
@@ -1151,7 +2083,6 @@
   <w:style w:type="character" w:default="1" w:styleId="DefaultParagraphFont">
     <w:name w:val="Default Paragraph Font"/>
     <w:uiPriority w:val="1"/>
-    <w:semiHidden/>
     <w:unhideWhenUsed/>
   </w:style>
   <w:style w:type="table" w:default="1" w:styleId="TableNormal">
@@ -1476,6 +2407,25 @@
       <w:iCs/>
       <w:color w:val="404040" w:themeColor="text1" w:themeTint="BF"/>
     </w:rPr>
+  </w:style>
+  <w:style w:type="table" w:styleId="TableGrid">
+    <w:name w:val="Table Grid"/>
+    <w:basedOn w:val="TableNormal"/>
+    <w:uiPriority w:val="39"/>
+    <w:rsid w:val="00386EF7"/>
+    <w:pPr>
+      <w:spacing w:after="0" w:line="240" w:lineRule="auto"/>
+    </w:pPr>
+    <w:tblPr>
+      <w:tblBorders>
+        <w:top w:val="single" w:sz="4" w:space="0" w:color="auto"/>
+        <w:left w:val="single" w:sz="4" w:space="0" w:color="auto"/>
+        <w:bottom w:val="single" w:sz="4" w:space="0" w:color="auto"/>
+        <w:right w:val="single" w:sz="4" w:space="0" w:color="auto"/>
+        <w:insideH w:val="single" w:sz="4" w:space="0" w:color="auto"/>
+        <w:insideV w:val="single" w:sz="4" w:space="0" w:color="auto"/>
+      </w:tblBorders>
+    </w:tblPr>
   </w:style>
 </w:styles>
 </file>

</xml_diff>